<commit_message>
docs: add protein oats breakfast option to Candy's meal plan docx
</commit_message>
<xml_diff>
--- a/Candys_New_Meal_Plan.docx
+++ b/Candys_New_Meal_Plan.docx
@@ -132,7 +132,7 @@
           <w:color w:val="1E293B"/>
           <w:sz w:val="20"/>
         </w:rPr>
-        <w:t xml:space="preserve">Whole Eggs to Egg Whites: </w:t>
+        <w:t xml:space="preserve">Whole Eggs to Egg Whites / Whey: </w:t>
       </w:r>
       <w:r>
         <w:rPr>
@@ -140,7 +140,7 @@
           <w:color w:val="1E293B"/>
           <w:sz w:val="20"/>
         </w:rPr>
-        <w:t>Egg yolk tested RED Sensitive on your food test; egg whites are 100% safe and prevent gut inflammation.</w:t>
+        <w:t>Egg yolk tested RED Sensitive on your food test. Egg whites or a scoop of Whey Isolate are 100% safe and prevent gut inflammation.</w:t>
       </w:r>
     </w:p>
     <w:p>
@@ -256,7 +256,7 @@
           <w:color w:val="1E293B"/>
           <w:sz w:val="20"/>
         </w:rPr>
-        <w:t>Option A: 3 to 4 Egg Whites scrambled with baby spinach + 1.5 oz large flake oats with 1/2 cup frozen blueberries.</w:t>
+        <w:t>Option A (Protein Oats): 1.5 oz large flake oats cooked in water, stirred with 1 scoop Whey Protein Isolate (24g protein) + 1/2 cup frozen blueberries. (Total: ~29g protein — quick, warm &amp; zero eggs!).</w:t>
       </w:r>
     </w:p>
     <w:p>
@@ -270,7 +270,21 @@
           <w:color w:val="1E293B"/>
           <w:sz w:val="20"/>
         </w:rPr>
-        <w:t>Option B: Lactose-Free Greek Yogurt Bowl (or Lactose-Free Cottage Cheese) with 1/2 cup blueberries and 1 tablespoon pumpkin seeds.</w:t>
+        <w:t>Option B (Egg Whites): 3 to 4 Egg Whites scrambled with baby spinach + 1.5 oz oats with 1/2 cup frozen blueberries.</w:t>
+      </w:r>
+    </w:p>
+    <w:p>
+      <w:pPr>
+        <w:pStyle w:val="ListBullet"/>
+        <w:spacing w:after="40"/>
+      </w:pPr>
+      <w:r>
+        <w:rPr>
+          <w:rFonts w:ascii="Arial" w:hAnsi="Arial"/>
+          <w:color w:val="1E293B"/>
+          <w:sz w:val="20"/>
+        </w:rPr>
+        <w:t>Option C (Yogurt Bowl): Lactose-Free Greek Yogurt Bowl (or LF Cottage Cheese) with 1/2 cup blueberries and 1 tablespoon pumpkin seeds.</w:t>
       </w:r>
     </w:p>
     <w:p>
@@ -480,7 +494,7 @@
           <w:color w:val="64748B"/>
           <w:sz w:val="18"/>
         </w:rPr>
-        <w:t>Golden Rule: Eat on the clock, not by hunger. Ozempic and Vyvanse turn off your appetite during the day, which causes evening cravings if you skip daytime meals. Fueling your body every 3 hours keeps your metabolism running and makes shedding the 6 lbs effortless.</w:t>
+        <w:t>Golden Rule: Eat on the clock, not by hunger. Ozempic and Vyvanse turn off daytime appetite, which causes evening cravings if you under-eat. Fueling your body every 3 hours keeps your metabolism running and makes shedding the 6 lbs effortless.</w:t>
       </w:r>
     </w:p>
     <w:sectPr>

</xml_diff>